<commit_message>
Corregir escenarios de aceptacion y preparar evidencia de entrega
</commit_message>
<xml_diff>
--- a/docs/Proyecto-Hackathon-1.docx
+++ b/docs/Proyecto-Hackathon-1.docx
@@ -55,7 +55,7 @@
         <w:pStyle w:val="ListBullet"/>
       </w:pPr>
       <w:r>
-        <w:t>Chat como vista principal, con lenguaje breve en español, indicador de búsqueda y fuentes discretas al pie de cada respuesta.</w:t>
+        <w:t>Chat como vista principal, con respuestas breves en español e indicador de búsqueda. El botón flotante abre el menú sin desplazar el chat.</w:t>
       </w:r>
     </w:p>
     <w:p>
@@ -92,7 +92,7 @@
     </w:p>
     <w:p>
       <w:r>
-        <w:t>RAG recupera información del menú mediante embeddings multilingües MiniLM, búsqueda por términos y coincidencias del catálogo. El backend interpreta las preferencias de forma conservadora, consulta el estado guardado y envía a Llama 3.2 1B Instruct un contexto acotado. El modelo genera un borrador interno; los precios y la disponibilidad de la respuesta final se validan con los datos, sin aceptar hechos libres que los contradigan.</w:t>
+        <w:t>RAG recupera información del menú con MiniLM multilingüe, búsqueda por términos y coincidencias del catálogo. Llama 3.2 1B Instruct clasifica la intención de la consulta. El sistema conserva preferencias explícitas entre turnos, pide aclaraciones y construye los precios y la disponibilidad desde datos comprobados. El modelo no decide los importes ni los permisos.</w:t>
       </w:r>
     </w:p>
     <w:p>
@@ -115,7 +115,7 @@
     </w:p>
     <w:p>
       <w:r>
-        <w:t>El proyecto aplica prompting, RAG, Llama y evaluación a la atención de clientes. Se exploró LoRA en Colab con Transformers y PEFT, sin demostrar una mejora suficiente de exactitud factual. El adaptador del despliegue sigue siendo experimental y sus borradores no tienen autoridad sobre los hechos. La copia pública permite ejecutar el modelo base sin adaptador.</w:t>
+        <w:t>El proyecto aplica prompting, RAG, Llama y evaluación a la atención de clientes. También se entrenó LoRA en Colab con Transformers y PEFT sobre 700 conversaciones sintéticas. La comparación de los adaptadores de 600 y 700 ejemplos no demostró una mejora global suficiente. La demo utiliza el modelo base sin LoRA; el notebook y los resultados del experimento se conservan en el repositorio.</w:t>
       </w:r>
     </w:p>
     <w:p>
@@ -128,7 +128,7 @@
     </w:p>
     <w:p>
       <w:r>
-        <w:t>La copia pública pasó 276 pruebas de catálogo, precios, recuperación, respuestas, persistencia, permisos y cola. Usan datos sintéticos y dobles de inferencia; no califican la calidad del modelo. En el VPS pasaron 49 pruebas de API, interfaz y conversación, con comprobación manual de acceso privado, guardado y consultas en HTTPS.</w:t>
+        <w:t>La copia pública pasó 328 pruebas automatizadas de negocio, persistencia, permisos y cola, con datos sintéticos y dobles de inferencia. Además, 20 de 20 escenarios funcionales pasaron con Llama y MiniLM reales en un entorno aislado, incluyendo cambios de existencias y desconexión. Kevin consideró adecuadas las respuestas y comprobó desde su celular ambos precios de E07. No se registró una revisión exhaustiva de teclado y cancelación.</w:t>
       </w:r>
     </w:p>
     <w:p>
@@ -136,7 +136,7 @@
         <w:pStyle w:val="ListBullet"/>
       </w:pPr>
       <w:r>
-        <w:t>Latte caliente mediano sin extras: respuesta de $70.00 MXN con referencia al menú.</w:t>
+        <w:t>Latte caliente mediano sin extras: $70.00 MXN, 12 oz / 360 ml. Iced Latte grande con avena y espresso extra: $110.00 MXN, 16 oz / 480 ml.</w:t>
       </w:r>
     </w:p>
     <w:p>
@@ -206,7 +206,7 @@
     </w:p>
     <w:p>
       <w:r>
-        <w:t>Es una demo académica sin pedidos, pagos, inventario real ni WhatsApp. Los datos provisionales están señalados. Las consultas ambiguas o con extras pueden requerir aclaraciones; no se declara una evaluación conversacional completa de 20 sobre 20. Siguen pendientes la revisión táctil desde celular y la evaluación humana integral.</w:t>
+        <w:t>Es una demo académica sin pedidos, pagos, inventario real ni WhatsApp. Los datos provisionales se señalan. Las consultas ambiguas requieren confirmación y los datos desconocidos se remiten al personal. Una batería finita no garantiza todas las conversaciones; la valoración humana del tono y la revisión táctil desde celular se registran por separado.</w:t>
       </w:r>
     </w:p>
     <w:p>

</xml_diff>

<commit_message>
Conservar preferencias y validar veinte escenarios del asistente (#1)
* Conservar preferencias explicitas entre consultas

* Corregir escenarios de aceptacion y preparar evidencia de entrega

---------

Co-authored-by: Kevin <kevyx-gif@users.noreply.github.com>
</commit_message>
<xml_diff>
--- a/docs/Proyecto-Hackathon-1.docx
+++ b/docs/Proyecto-Hackathon-1.docx
@@ -55,7 +55,7 @@
         <w:pStyle w:val="ListBullet"/>
       </w:pPr>
       <w:r>
-        <w:t>Chat como vista principal, con lenguaje breve en español, indicador de búsqueda y fuentes discretas al pie de cada respuesta.</w:t>
+        <w:t>Chat como vista principal, con respuestas breves en español e indicador de búsqueda. El botón flotante abre el menú sin desplazar el chat.</w:t>
       </w:r>
     </w:p>
     <w:p>
@@ -92,7 +92,7 @@
     </w:p>
     <w:p>
       <w:r>
-        <w:t>RAG recupera información del menú mediante embeddings multilingües MiniLM, búsqueda por términos y coincidencias del catálogo. El backend interpreta las preferencias de forma conservadora, consulta el estado guardado y envía a Llama 3.2 1B Instruct un contexto acotado. El modelo genera un borrador interno; los precios y la disponibilidad de la respuesta final se validan con los datos, sin aceptar hechos libres que los contradigan.</w:t>
+        <w:t>RAG recupera información del menú con MiniLM multilingüe, búsqueda por términos y coincidencias del catálogo. Llama 3.2 1B Instruct clasifica la intención de la consulta. El sistema conserva preferencias explícitas entre turnos, pide aclaraciones y construye los precios y la disponibilidad desde datos comprobados. El modelo no decide los importes ni los permisos.</w:t>
       </w:r>
     </w:p>
     <w:p>
@@ -115,7 +115,7 @@
     </w:p>
     <w:p>
       <w:r>
-        <w:t>El proyecto aplica prompting, RAG, Llama y evaluación a la atención de clientes. Se exploró LoRA en Colab con Transformers y PEFT, sin demostrar una mejora suficiente de exactitud factual. El adaptador del despliegue sigue siendo experimental y sus borradores no tienen autoridad sobre los hechos. La copia pública permite ejecutar el modelo base sin adaptador.</w:t>
+        <w:t>El proyecto aplica prompting, RAG, Llama y evaluación a la atención de clientes. También se entrenó LoRA en Colab con Transformers y PEFT sobre 700 conversaciones sintéticas. La comparación de los adaptadores de 600 y 700 ejemplos no demostró una mejora global suficiente. La demo utiliza el modelo base sin LoRA; el notebook y los resultados del experimento se conservan en el repositorio.</w:t>
       </w:r>
     </w:p>
     <w:p>
@@ -128,7 +128,7 @@
     </w:p>
     <w:p>
       <w:r>
-        <w:t>La copia pública pasó 276 pruebas de catálogo, precios, recuperación, respuestas, persistencia, permisos y cola. Usan datos sintéticos y dobles de inferencia; no califican la calidad del modelo. En el VPS pasaron 49 pruebas de API, interfaz y conversación, con comprobación manual de acceso privado, guardado y consultas en HTTPS.</w:t>
+        <w:t>La copia pública pasó 328 pruebas automatizadas de negocio, persistencia, permisos y cola, con datos sintéticos y dobles de inferencia. Además, 20 de 20 escenarios funcionales pasaron con Llama y MiniLM reales en un entorno aislado, incluyendo cambios de existencias y desconexión. Kevin consideró adecuadas las respuestas y comprobó desde su celular ambos precios de E07. No se registró una revisión exhaustiva de teclado y cancelación.</w:t>
       </w:r>
     </w:p>
     <w:p>
@@ -136,7 +136,7 @@
         <w:pStyle w:val="ListBullet"/>
       </w:pPr>
       <w:r>
-        <w:t>Latte caliente mediano sin extras: respuesta de $70.00 MXN con referencia al menú.</w:t>
+        <w:t>Latte caliente mediano sin extras: $70.00 MXN, 12 oz / 360 ml. Iced Latte grande con avena y espresso extra: $110.00 MXN, 16 oz / 480 ml.</w:t>
       </w:r>
     </w:p>
     <w:p>
@@ -206,7 +206,7 @@
     </w:p>
     <w:p>
       <w:r>
-        <w:t>Es una demo académica sin pedidos, pagos, inventario real ni WhatsApp. Los datos provisionales están señalados. Las consultas ambiguas o con extras pueden requerir aclaraciones; no se declara una evaluación conversacional completa de 20 sobre 20. Siguen pendientes la revisión táctil desde celular y la evaluación humana integral.</w:t>
+        <w:t>Es una demo académica sin pedidos, pagos, inventario real ni WhatsApp. Los datos provisionales se señalan. Las consultas ambiguas requieren confirmación y los datos desconocidos se remiten al personal. Una batería finita no garantiza todas las conversaciones; la valoración humana del tono y la revisión táctil desde celular se registran por separado.</w:t>
       </w:r>
     </w:p>
     <w:p>

</xml_diff>